<commit_message>
Finalize camera reliability and documentation audit
</commit_message>
<xml_diff>
--- a/docs/CareLoop_研究報告.docx
+++ b/docs/CareLoop_研究報告.docx
@@ -734,7 +734,7 @@
           <w:b w:val="0"/>
           <w:sz w:val="22"/>
         </w:rPr>
-        <w:t>本專案由三位備考中的高三生組成，在預算極為有限的條件下，試圖用「軟體能力」替代「硬體資源」，打造一個真正能在偏鄉家庭落地的工具。我們選擇這個題目，因為我們的阿公阿嬤就是潛在使用者，而他們所在的偏鄉根本沒有物理治療師定期到訪。</w:t>
+        <w:t>本專案由三位備考中的高三生組成，在預算極為有限的條件下，試圖用「軟體能力」替代「硬體資源」，打造一個真正能在偏鄉家庭落地的工具。我們選擇這個題目，因為偏鄉與資源有限家庭常缺乏可長期使用的動作觀察工具，而他們所在的偏鄉根本沒有物理治療師定期到訪。</w:t>
       </w:r>
     </w:p>
     <w:p>
@@ -1140,7 +1140,7 @@
           <w:b w:val="0"/>
           <w:sz w:val="22"/>
         </w:rPr>
-        <w:t>情境：阿嬤每天早上完成坐站訓練後，打開手機上的 CareLoop，讓系統透過前鏡頭觀察她做五次坐站的動作，分析結果自動儲存在手機本機。下午兒子打來關心時，兒子可以問「今天阿嬤狀況怎樣」，家屬頁面的規則式問答會根據今天的測試結果給出一句摘要：「今天動作順暢，速度比昨天快 8%。」</w:t>
+        <w:t>情境：使用者每天早上完成坐站訓練後，打開手機上的 CareLoop，讓系統透過前鏡頭觀察她做五次坐站的動作，分析結果自動儲存在手機本機。下午家人打來關心時，可以問「今天狀況怎樣」，家屬頁面的規則式問答會根據今天的測試結果給出一句摘要：「今天動作順暢，速度比昨天快 8%。」</w:t>
       </w:r>
     </w:p>
     <w:p>
@@ -2669,7 +2669,7 @@
           <w:color w:val="2D5F5D"/>
           <w:sz w:val="20"/>
         </w:rPr>
-        <w:t>MAX_TILT_DEG_ATTENTION = 10°</w:t>
+        <w:t>MAX_TILT_DEG_ATTENTION = 20°</w:t>
       </w:r>
     </w:p>
     <w:p>
@@ -2685,7 +2685,7 @@
           <w:color w:val="4B5563"/>
           <w:sz w:val="20"/>
         </w:rPr>
-        <w:t>→ 臨床觀察建議，&gt;10° 開始介入 → 觸發 attention</w:t>
+        <w:t>→ 居家攝影機容錯後，≥20° 才觸發 attention</w:t>
       </w:r>
     </w:p>
     <w:p>
@@ -2700,7 +2700,7 @@
           <w:color w:val="2D5F5D"/>
           <w:sz w:val="20"/>
         </w:rPr>
-        <w:t>MAX_TILT_DEG_REVIEW = 18°</w:t>
+        <w:t>MAX_TILT_DEG_REVIEW = 35°</w:t>
       </w:r>
     </w:p>
     <w:p>
@@ -2716,7 +2716,7 @@
           <w:color w:val="4B5563"/>
           <w:sz w:val="20"/>
         </w:rPr>
-        <w:t>→ 明顯異常值，&gt;18° → 觸發 review</w:t>
+        <w:t>→ 明顯持續偏移，≥35° 才觸發 review</w:t>
       </w:r>
     </w:p>
     <w:p>
@@ -2842,7 +2842,7 @@
           <w:b w:val="0"/>
           <w:sz w:val="22"/>
         </w:rPr>
-        <w:t>步驟 3：檢查 tiltMaxDeg ≥ 18° → review / ≥ 10° → attention</w:t>
+        <w:t>步驟 3：檢查 tiltMaxDeg ≥ 35° → review / ≥ 20° → attention</w:t>
       </w:r>
     </w:p>
     <w:p>
@@ -3537,7 +3537,7 @@
           <w:b w:val="0"/>
           <w:sz w:val="22"/>
         </w:rPr>
-        <w:t>偏斜角度：基礎 5° + z-score × 3.2°，加個體隨機變異（SD ≈ 4°），上限 35°</w:t>
+        <w:t>偏斜角度：基礎 5° + z-score × 3.2°，加個體隨機變異（SD ≈ 4°），上限 45°；決策閾值採居家攝影機容錯後的 20° / 35°</w:t>
       </w:r>
     </w:p>
     <w:p>
@@ -7268,7 +7268,7 @@
                 <w:b w:val="0"/>
                 <w:sz w:val="20"/>
               </w:rPr>
-              <w:t>核心運算全本機完成，只有初次載入需要網路</w:t>
+              <w:t>MediaPipe WASM 與模型已本機化；核心拍攝測試不依賴外部 CDN</w:t>
             </w:r>
           </w:p>
         </w:tc>
@@ -8154,7 +8154,7 @@
           <w:b w:val="0"/>
           <w:sz w:val="22"/>
         </w:rPr>
-        <w:t>所有頁面中不出現「醫療診斷」「高風險」「FDA 認可」等字眼</w:t>
+        <w:t>所有頁面中不出現「醫療診斷」「高風險判定」「法規認可」等過度宣稱</w:t>
       </w:r>
     </w:p>
     <w:p>

</xml_diff>